<commit_message>
Fix: build into docs/ instead of output-dir: . (preview-safe)
output-dir: . breaks 'quarto preview'/RStudio ('Source and destination
cannot be the same'). Switch to the supported no-CI path: output-dir: docs
+ GitHub Pages serving /docs. Copy assets/, blog/posts stubs and lab/ into
docs/ via resources so existing URLs keep working. Remove stale in-place
root build; update CLAUDE.md and the how-to guide.

Co-Authored-By: Claude Opus 4.7 (1M context) <noreply@anthropic.com>
</commit_message>
<xml_diff>
--- a/How-to-Add-a-Blog-Post.docx
+++ b/How-to-Add-a-Blog-Post.docx
@@ -137,6 +137,159 @@
         <w:t xml:space="preserve">beyond Quarto and Git.</w:t>
       </w:r>
     </w:p>
+    <w:p>
+      <w:pPr>
+        <w:pStyle w:val="BlockText"/>
+      </w:pPr>
+      <w:r>
+        <w:rPr>
+          <w:b/>
+          <w:bCs/>
+        </w:rPr>
+        <w:t xml:space="preserve">One-time setup (done once, ever).</w:t>
+      </w:r>
+      <w:r>
+        <w:t xml:space="preserve"> </w:t>
+      </w:r>
+      <w:r>
+        <w:t xml:space="preserve">On GitHub: open the repository →</w:t>
+      </w:r>
+      <w:r>
+        <w:t xml:space="preserve"> </w:t>
+      </w:r>
+      <w:r>
+        <w:rPr>
+          <w:b/>
+          <w:bCs/>
+        </w:rPr>
+        <w:t xml:space="preserve">Settings → Pages</w:t>
+      </w:r>
+      <w:r>
+        <w:t xml:space="preserve">. Under</w:t>
+      </w:r>
+      <w:r>
+        <w:t xml:space="preserve"> </w:t>
+      </w:r>
+      <w:r>
+        <w:t xml:space="preserve">“Build and deployment”</w:t>
+      </w:r>
+      <w:r>
+        <w:t xml:space="preserve"> </w:t>
+      </w:r>
+      <w:r>
+        <w:t xml:space="preserve">set</w:t>
+      </w:r>
+      <w:r>
+        <w:t xml:space="preserve"> </w:t>
+      </w:r>
+      <w:r>
+        <w:rPr>
+          <w:b/>
+          <w:bCs/>
+        </w:rPr>
+        <w:t xml:space="preserve">Source: Deploy from</w:t>
+      </w:r>
+      <w:r>
+        <w:rPr>
+          <w:b/>
+          <w:bCs/>
+        </w:rPr>
+        <w:t xml:space="preserve"> </w:t>
+      </w:r>
+      <w:r>
+        <w:rPr>
+          <w:b/>
+          <w:bCs/>
+        </w:rPr>
+        <w:t xml:space="preserve">a branch</w:t>
+      </w:r>
+      <w:r>
+        <w:t xml:space="preserve">,</w:t>
+      </w:r>
+      <w:r>
+        <w:t xml:space="preserve"> </w:t>
+      </w:r>
+      <w:r>
+        <w:rPr>
+          <w:b/>
+          <w:bCs/>
+        </w:rPr>
+        <w:t xml:space="preserve">Branch:</w:t>
+      </w:r>
+      <w:r>
+        <w:rPr>
+          <w:b/>
+          <w:bCs/>
+        </w:rPr>
+        <w:t xml:space="preserve"> </w:t>
+      </w:r>
+      <w:r>
+        <w:rPr>
+          <w:rStyle w:val="VerbatimChar"/>
+          <w:b/>
+          <w:bCs/>
+        </w:rPr>
+        <w:t xml:space="preserve">main</w:t>
+      </w:r>
+      <w:r>
+        <w:t xml:space="preserve">,</w:t>
+      </w:r>
+      <w:r>
+        <w:t xml:space="preserve"> </w:t>
+      </w:r>
+      <w:r>
+        <w:rPr>
+          <w:b/>
+          <w:bCs/>
+        </w:rPr>
+        <w:t xml:space="preserve">Folder:</w:t>
+      </w:r>
+      <w:r>
+        <w:rPr>
+          <w:b/>
+          <w:bCs/>
+        </w:rPr>
+        <w:t xml:space="preserve"> </w:t>
+      </w:r>
+      <w:r>
+        <w:rPr>
+          <w:rStyle w:val="VerbatimChar"/>
+          <w:b/>
+          <w:bCs/>
+        </w:rPr>
+        <w:t xml:space="preserve">/docs</w:t>
+      </w:r>
+      <w:r>
+        <w:t xml:space="preserve">, and Save. You never need</w:t>
+      </w:r>
+      <w:r>
+        <w:t xml:space="preserve"> </w:t>
+      </w:r>
+      <w:r>
+        <w:t xml:space="preserve">to touch this again. (The website is built into the</w:t>
+      </w:r>
+      <w:r>
+        <w:t xml:space="preserve"> </w:t>
+      </w:r>
+      <w:r>
+        <w:rPr>
+          <w:rStyle w:val="VerbatimChar"/>
+        </w:rPr>
+        <w:t xml:space="preserve">docs</w:t>
+      </w:r>
+      <w:r>
+        <w:t xml:space="preserve"> </w:t>
+      </w:r>
+      <w:r>
+        <w:t xml:space="preserve">folder; this tells</w:t>
+      </w:r>
+      <w:r>
+        <w:t xml:space="preserve"> </w:t>
+      </w:r>
+      <w:r>
+        <w:t xml:space="preserve">GitHub to publish that folder.)</w:t>
+      </w:r>
+    </w:p>
     <w:bookmarkEnd w:id="20"/>
     <w:bookmarkStart w:id="25" w:name="the-4-step-workflow"/>
     <w:p>
@@ -627,10 +780,31 @@
         <w:rPr>
           <w:rStyle w:val="VerbatimChar"/>
         </w:rPr>
-        <w:t xml:space="preserve">Output created: index.html</w:t>
-      </w:r>
-      <w:r>
-        <w:t xml:space="preserve">, with no red error text.</w:t>
+        <w:t xml:space="preserve">Output created: docs\index.html</w:t>
+      </w:r>
+      <w:r>
+        <w:t xml:space="preserve">, with no red error text. (The finished</w:t>
+      </w:r>
+      <w:r>
+        <w:t xml:space="preserve"> </w:t>
+      </w:r>
+      <w:r>
+        <w:t xml:space="preserve">website is written into the</w:t>
+      </w:r>
+      <w:r>
+        <w:t xml:space="preserve"> </w:t>
+      </w:r>
+      <w:r>
+        <w:rPr>
+          <w:rStyle w:val="VerbatimChar"/>
+        </w:rPr>
+        <w:t xml:space="preserve">docs</w:t>
+      </w:r>
+      <w:r>
+        <w:t xml:space="preserve"> </w:t>
+      </w:r>
+      <w:r>
+        <w:t xml:space="preserve">folder — that is what gets published.)</w:t>
       </w:r>
     </w:p>
     <w:p>

</xml_diff>

<commit_message>
Workflow hardening: draft-by-default template, cwd-safe guide, new cover images
- _post-template.qmd now ships draft: true (new posts hidden until ready) so
  half-written posts can never publish by accident
- How-to guide: add Step 0 (be in project root) + draft-removal step; prevents
  the posts\posts nesting error
- New brand cover images: cost-of-staying-alive.png (health-financing),
  trade-under-guard.png (ug-exports); fix .jpg/.png extension mismatch
- Scaffold posts/the-matthew-effect/ (hidden draft, ready for text)

Co-Authored-By: Claude Opus 4.7 (1M context) <noreply@anthropic.com>
</commit_message>
<xml_diff>
--- a/How-to-Add-a-Blog-Post.docx
+++ b/How-to-Add-a-Blog-Post.docx
@@ -291,7 +291,7 @@
       </w:r>
     </w:p>
     <w:bookmarkEnd w:id="20"/>
-    <w:bookmarkStart w:id="25" w:name="the-4-step-workflow"/>
+    <w:bookmarkStart w:id="26" w:name="the-4-step-workflow"/>
     <w:p>
       <w:pPr>
         <w:pStyle w:val="Heading1"/>
@@ -300,12 +300,43 @@
         <w:t xml:space="preserve">The 4-step workflow</w:t>
       </w:r>
     </w:p>
+    <w:bookmarkStart w:id="21" w:name="X592a2d75597ca94e559554a6735428dcdcdbe36"/>
+    <w:p>
+      <w:pPr>
+        <w:pStyle w:val="Heading2"/>
+      </w:pPr>
+      <w:r>
+        <w:t xml:space="preserve">Step 0 — Be in the right folder (do this first, every time)</w:t>
+      </w:r>
+    </w:p>
     <w:p>
       <w:pPr>
         <w:pStyle w:val="FirstParagraph"/>
       </w:pPr>
       <w:r>
-        <w:t xml:space="preserve">Do everything from the project folder:</w:t>
+        <w:t xml:space="preserve">Every command below must be run from the</w:t>
+      </w:r>
+      <w:r>
+        <w:t xml:space="preserve"> </w:t>
+      </w:r>
+      <w:r>
+        <w:rPr>
+          <w:b/>
+          <w:bCs/>
+        </w:rPr>
+        <w:t xml:space="preserve">project root</w:t>
+      </w:r>
+      <w:r>
+        <w:t xml:space="preserve"> </w:t>
+      </w:r>
+      <w:r>
+        <w:t xml:space="preserve">—</w:t>
+      </w:r>
+      <w:r>
+        <w:t xml:space="preserve"> </w:t>
+      </w:r>
+      <w:r>
+        <w:t xml:space="preserve">the</w:t>
       </w:r>
       <w:r>
         <w:t xml:space="preserve"> </w:t>
@@ -316,383 +347,48 @@
         </w:rPr>
         <w:t xml:space="preserve">bk-advisors.github.io</w:t>
       </w:r>
-    </w:p>
-    <w:bookmarkStart w:id="21" w:name="step-1-create-the-post-folder"/>
-    <w:p>
-      <w:pPr>
-        <w:pStyle w:val="Heading2"/>
-      </w:pPr>
-      <w:r>
-        <w:t xml:space="preserve">Step 1 — Create the post folder</w:t>
-      </w:r>
-    </w:p>
-    <w:p>
-      <w:pPr>
-        <w:pStyle w:val="FirstParagraph"/>
-      </w:pPr>
-      <w:r>
-        <w:t xml:space="preserve">Pick a short</w:t>
-      </w:r>
-      <w:r>
-        <w:t xml:space="preserve"> </w:t>
-      </w:r>
-      <w:r>
-        <w:t xml:space="preserve">“slug”</w:t>
-      </w:r>
-      <w:r>
-        <w:t xml:space="preserve"> </w:t>
-      </w:r>
-      <w:r>
-        <w:t xml:space="preserve">(lowercase words joined by hyphens) — this becomes the web</w:t>
-      </w:r>
-      <w:r>
-        <w:t xml:space="preserve"> </w:t>
-      </w:r>
-      <w:r>
-        <w:t xml:space="preserve">address, e.g. </w:t>
-      </w:r>
-      <w:r>
-        <w:rPr>
-          <w:rStyle w:val="VerbatimChar"/>
-        </w:rPr>
-        <w:t xml:space="preserve">the-matthew-effect</w:t>
-      </w:r>
-      <w:r>
-        <w:t xml:space="preserve"> </w:t>
-      </w:r>
-      <w:r>
-        <w:t xml:space="preserve">→</w:t>
-      </w:r>
-      <w:r>
-        <w:t xml:space="preserve"> </w:t>
-      </w:r>
-      <w:r>
-        <w:rPr>
-          <w:rStyle w:val="VerbatimChar"/>
-        </w:rPr>
-        <w:t xml:space="preserve">bk-advisors.github.io/posts/the-matthew-effect/</w:t>
-      </w:r>
-      <w:r>
-        <w:t xml:space="preserve">.</w:t>
-      </w:r>
-    </w:p>
-    <w:p>
-      <w:pPr>
-        <w:pStyle w:val="BodyText"/>
-      </w:pPr>
-      <w:r>
-        <w:t xml:space="preserve">Copy the template into a new folder. In a terminal:</w:t>
-      </w:r>
-    </w:p>
-    <w:p>
-      <w:pPr>
-        <w:pStyle w:val="SourceCode"/>
-      </w:pPr>
-      <w:r>
-        <w:rPr>
-          <w:rStyle w:val="VerbatimChar"/>
-        </w:rPr>
-        <w:t xml:space="preserve">mkdir posts\the-matthew-effect</w:t>
-      </w:r>
-      <w:r>
-        <w:br/>
-      </w:r>
-      <w:r>
-        <w:rPr>
-          <w:rStyle w:val="VerbatimChar"/>
-        </w:rPr>
-        <w:t xml:space="preserve">mkdir posts\the-matthew-effect\images</w:t>
-      </w:r>
-      <w:r>
-        <w:br/>
-      </w:r>
-      <w:r>
-        <w:rPr>
-          <w:rStyle w:val="VerbatimChar"/>
-        </w:rPr>
-        <w:t xml:space="preserve">copy posts\_post-template.qmd posts\the-matthew-effect\index.qmd</w:t>
-      </w:r>
-    </w:p>
-    <w:p>
-      <w:pPr>
-        <w:pStyle w:val="FirstParagraph"/>
-      </w:pPr>
-      <w:r>
-        <w:rPr>
-          <w:b/>
-          <w:bCs/>
-        </w:rPr>
-        <w:t xml:space="preserve">Success looks like:</w:t>
-      </w:r>
-      <w:r>
-        <w:t xml:space="preserve"> </w:t>
-      </w:r>
-      <w:r>
-        <w:t xml:space="preserve">a new folder</w:t>
-      </w:r>
-      <w:r>
-        <w:t xml:space="preserve"> </w:t>
-      </w:r>
-      <w:r>
-        <w:rPr>
-          <w:rStyle w:val="VerbatimChar"/>
-        </w:rPr>
-        <w:t xml:space="preserve">posts\the-matthew-effect\</w:t>
-      </w:r>
-      <w:r>
-        <w:t xml:space="preserve"> </w:t>
-      </w:r>
-      <w:r>
-        <w:t xml:space="preserve">containing</w:t>
-      </w:r>
-      <w:r>
-        <w:t xml:space="preserve"> </w:t>
-      </w:r>
-      <w:r>
-        <w:rPr>
-          <w:rStyle w:val="VerbatimChar"/>
-        </w:rPr>
-        <w:t xml:space="preserve">index.qmd</w:t>
-      </w:r>
-      <w:r>
-        <w:t xml:space="preserve"> </w:t>
-      </w:r>
-      <w:r>
-        <w:t xml:space="preserve">and an empty</w:t>
-      </w:r>
-      <w:r>
-        <w:t xml:space="preserve"> </w:t>
-      </w:r>
-      <w:r>
-        <w:rPr>
-          <w:rStyle w:val="VerbatimChar"/>
-        </w:rPr>
-        <w:t xml:space="preserve">images</w:t>
-      </w:r>
-      <w:r>
-        <w:t xml:space="preserve"> </w:t>
-      </w:r>
-      <w:r>
-        <w:t xml:space="preserve">folder.</w:t>
-      </w:r>
-    </w:p>
-    <w:bookmarkEnd w:id="21"/>
-    <w:bookmarkStart w:id="22" w:name="X491b6c6a05ee6266c0a4a61bb751f404fa1e581"/>
-    <w:p>
-      <w:pPr>
-        <w:pStyle w:val="Heading2"/>
-      </w:pPr>
-      <w:r>
-        <w:t xml:space="preserve">Step 2 — Paste your article and fill in the details</w:t>
-      </w:r>
-    </w:p>
-    <w:p>
-      <w:pPr>
-        <w:pStyle w:val="FirstParagraph"/>
-      </w:pPr>
-      <w:r>
-        <w:t xml:space="preserve">Open</w:t>
-      </w:r>
-      <w:r>
-        <w:t xml:space="preserve"> </w:t>
-      </w:r>
-      <w:r>
-        <w:rPr>
-          <w:rStyle w:val="VerbatimChar"/>
-        </w:rPr>
-        <w:t xml:space="preserve">posts\the-matthew-effect\index.qmd</w:t>
-      </w:r>
-      <w:r>
-        <w:t xml:space="preserve"> </w:t>
-      </w:r>
-      <w:r>
-        <w:t xml:space="preserve">in any text editor.</w:t>
-      </w:r>
-    </w:p>
-    <w:p>
-      <w:pPr>
-        <w:pStyle w:val="BodyText"/>
-      </w:pPr>
-      <w:r>
-        <w:t xml:space="preserve">At the very top, between the two</w:t>
-      </w:r>
-      <w:r>
-        <w:t xml:space="preserve"> </w:t>
-      </w:r>
-      <w:r>
-        <w:rPr>
-          <w:rStyle w:val="VerbatimChar"/>
-        </w:rPr>
-        <w:t xml:space="preserve">---</w:t>
-      </w:r>
-      <w:r>
-        <w:t xml:space="preserve"> </w:t>
-      </w:r>
-      <w:r>
-        <w:t xml:space="preserve">lines, fill in the five fields (keep the</w:t>
-      </w:r>
-      <w:r>
-        <w:t xml:space="preserve"> </w:t>
-      </w:r>
-      <w:r>
-        <w:t xml:space="preserve">quotation marks):</w:t>
-      </w:r>
-    </w:p>
-    <w:p>
-      <w:pPr>
-        <w:pStyle w:val="SourceCode"/>
-      </w:pPr>
-      <w:r>
-        <w:rPr>
-          <w:rStyle w:val="VerbatimChar"/>
-        </w:rPr>
-        <w:t xml:space="preserve">---</w:t>
-      </w:r>
-      <w:r>
-        <w:br/>
-      </w:r>
-      <w:r>
-        <w:rPr>
-          <w:rStyle w:val="VerbatimChar"/>
-        </w:rPr>
-        <w:t xml:space="preserve">title: "The Matthew Effect"</w:t>
-      </w:r>
-      <w:r>
-        <w:br/>
-      </w:r>
-      <w:r>
-        <w:rPr>
-          <w:rStyle w:val="VerbatimChar"/>
-        </w:rPr>
-        <w:t xml:space="preserve">date: "2025-09-30"</w:t>
-      </w:r>
-      <w:r>
-        <w:br/>
-      </w:r>
-      <w:r>
-        <w:rPr>
-          <w:rStyle w:val="VerbatimChar"/>
-        </w:rPr>
-        <w:t xml:space="preserve">categories: [Political Economy]</w:t>
-      </w:r>
-      <w:r>
-        <w:br/>
-      </w:r>
-      <w:r>
-        <w:rPr>
-          <w:rStyle w:val="VerbatimChar"/>
-        </w:rPr>
-        <w:t xml:space="preserve">image: "images/cover.jpg"</w:t>
-      </w:r>
-      <w:r>
-        <w:br/>
-      </w:r>
-      <w:r>
-        <w:rPr>
-          <w:rStyle w:val="VerbatimChar"/>
-        </w:rPr>
-        <w:t xml:space="preserve">description: "One sentence that will appear on the home-page card."</w:t>
-      </w:r>
-      <w:r>
-        <w:br/>
-      </w:r>
-      <w:r>
-        <w:rPr>
-          <w:rStyle w:val="VerbatimChar"/>
-        </w:rPr>
-        <w:t xml:space="preserve">---</w:t>
-      </w:r>
-    </w:p>
-    <w:p>
-      <w:pPr>
-        <w:pStyle w:val="FirstParagraph"/>
-      </w:pPr>
-      <w:r>
-        <w:t xml:space="preserve">Then</w:t>
-      </w:r>
-      <w:r>
-        <w:t xml:space="preserve"> </w:t>
-      </w:r>
-      <w:r>
-        <w:rPr>
-          <w:b/>
-          <w:bCs/>
-        </w:rPr>
-        <w:t xml:space="preserve">delete the instructional comment block</w:t>
-      </w:r>
-      <w:r>
-        <w:t xml:space="preserve"> </w:t>
-      </w:r>
-      <w:r>
-        <w:t xml:space="preserve">and</w:t>
-      </w:r>
-      <w:r>
-        <w:t xml:space="preserve"> </w:t>
-      </w:r>
-      <w:r>
-        <w:rPr>
-          <w:b/>
-          <w:bCs/>
-        </w:rPr>
-        <w:t xml:space="preserve">paste your LinkedIn</w:t>
-      </w:r>
-      <w:r>
-        <w:rPr>
-          <w:b/>
-          <w:bCs/>
-        </w:rPr>
-        <w:t xml:space="preserve"> </w:t>
-      </w:r>
-      <w:r>
-        <w:rPr>
-          <w:b/>
-          <w:bCs/>
-        </w:rPr>
-        <w:t xml:space="preserve">article text</w:t>
-      </w:r>
-      <w:r>
-        <w:t xml:space="preserve"> </w:t>
-      </w:r>
-      <w:r>
-        <w:t xml:space="preserve">below it. Drop your cover picture into the post’s</w:t>
-      </w:r>
-      <w:r>
-        <w:t xml:space="preserve"> </w:t>
-      </w:r>
-      <w:r>
-        <w:rPr>
-          <w:rStyle w:val="VerbatimChar"/>
-        </w:rPr>
-        <w:t xml:space="preserve">images</w:t>
-      </w:r>
-      <w:r>
-        <w:t xml:space="preserve"> </w:t>
-      </w:r>
-      <w:r>
-        <w:t xml:space="preserve">folder and make sure the</w:t>
-      </w:r>
-      <w:r>
-        <w:t xml:space="preserve"> </w:t>
-      </w:r>
-      <w:r>
-        <w:rPr>
-          <w:rStyle w:val="VerbatimChar"/>
-        </w:rPr>
-        <w:t xml:space="preserve">image:</w:t>
-      </w:r>
-      <w:r>
-        <w:t xml:space="preserve"> </w:t>
-      </w:r>
-      <w:r>
-        <w:t xml:space="preserve">line points at its file name.</w:t>
-      </w:r>
-    </w:p>
-    <w:p>
-      <w:pPr>
-        <w:pStyle w:val="BodyText"/>
-      </w:pPr>
-      <w:r>
-        <w:t xml:space="preserve">See</w:t>
+      <w:r>
+        <w:t xml:space="preserve"> </w:t>
+      </w:r>
+      <w:r>
+        <w:t xml:space="preserve">folder itself,</w:t>
+      </w:r>
+      <w:r>
+        <w:t xml:space="preserve"> </w:t>
+      </w:r>
+      <w:r>
+        <w:rPr>
+          <w:b/>
+          <w:bCs/>
+        </w:rPr>
+        <w:t xml:space="preserve">not</w:t>
+      </w:r>
+      <w:r>
+        <w:t xml:space="preserve"> </w:t>
+      </w:r>
+      <w:r>
+        <w:t xml:space="preserve">from inside</w:t>
+      </w:r>
+      <w:r>
+        <w:t xml:space="preserve"> </w:t>
+      </w:r>
+      <w:r>
+        <w:rPr>
+          <w:rStyle w:val="VerbatimChar"/>
+        </w:rPr>
+        <w:t xml:space="preserve">posts</w:t>
+      </w:r>
+      <w:r>
+        <w:t xml:space="preserve"> </w:t>
+      </w:r>
+      <w:r>
+        <w:t xml:space="preserve">or any</w:t>
+      </w:r>
+      <w:r>
+        <w:t xml:space="preserve"> </w:t>
+      </w:r>
+      <w:r>
+        <w:t xml:space="preserve">other sub-folder. If you run them from the wrong place you get errors like</w:t>
       </w:r>
       <w:r>
         <w:t xml:space="preserve"> </w:t>
@@ -702,22 +398,599 @@
           <w:i/>
           <w:iCs/>
         </w:rPr>
-        <w:t xml:space="preserve">Front-matter at a glance</w:t>
-      </w:r>
-      <w:r>
-        <w:t xml:space="preserve"> </w:t>
-      </w:r>
-      <w:r>
-        <w:t xml:space="preserve">and the</w:t>
-      </w:r>
-      <w:r>
-        <w:t xml:space="preserve"> </w:t>
+        <w:t xml:space="preserve">“Cannot find path … posts</w:t>
       </w:r>
       <w:r>
         <w:rPr>
           <w:i/>
           <w:iCs/>
         </w:rPr>
+        <w:t xml:space="preserve">…”</w:t>
+      </w:r>
+      <w:r>
+        <w:t xml:space="preserve">.</w:t>
+      </w:r>
+    </w:p>
+    <w:p>
+      <w:pPr>
+        <w:pStyle w:val="BodyText"/>
+      </w:pPr>
+      <w:r>
+        <w:t xml:space="preserve">In your terminal, paste this once to move to the project root (keep the quotes):</w:t>
+      </w:r>
+    </w:p>
+    <w:p>
+      <w:pPr>
+        <w:pStyle w:val="SourceCode"/>
+      </w:pPr>
+      <w:r>
+        <w:rPr>
+          <w:rStyle w:val="VerbatimChar"/>
+        </w:rPr>
+        <w:t xml:space="preserve">Set-Location "C:\Users\HP\Desktop\Parking Lot\1 Frequently Used\Web Projects\bk-github\bk-advisors.github.io"</w:t>
+      </w:r>
+    </w:p>
+    <w:p>
+      <w:pPr>
+        <w:pStyle w:val="FirstParagraph"/>
+      </w:pPr>
+      <w:r>
+        <w:rPr>
+          <w:b/>
+          <w:bCs/>
+        </w:rPr>
+        <w:t xml:space="preserve">Check:</w:t>
+      </w:r>
+      <w:r>
+        <w:t xml:space="preserve"> </w:t>
+      </w:r>
+      <w:r>
+        <w:t xml:space="preserve">the prompt line should now end with</w:t>
+      </w:r>
+      <w:r>
+        <w:t xml:space="preserve"> </w:t>
+      </w:r>
+      <w:r>
+        <w:rPr>
+          <w:rStyle w:val="VerbatimChar"/>
+        </w:rPr>
+        <w:t xml:space="preserve">...\bk-advisors.github.io&gt;</w:t>
+      </w:r>
+      <w:r>
+        <w:t xml:space="preserve"> </w:t>
+      </w:r>
+      <w:r>
+        <w:t xml:space="preserve">(it must NOT end with</w:t>
+      </w:r>
+      <w:r>
+        <w:t xml:space="preserve"> </w:t>
+      </w:r>
+      <w:r>
+        <w:rPr>
+          <w:rStyle w:val="VerbatimChar"/>
+        </w:rPr>
+        <w:t xml:space="preserve">...\posts&gt;</w:t>
+      </w:r>
+      <w:r>
+        <w:t xml:space="preserve">). Tip: in RStudio, the Terminal already</w:t>
+      </w:r>
+      <w:r>
+        <w:t xml:space="preserve"> </w:t>
+      </w:r>
+      <w:r>
+        <w:t xml:space="preserve">opens here — just confirm the prompt before continuing.</w:t>
+      </w:r>
+    </w:p>
+    <w:bookmarkEnd w:id="21"/>
+    <w:bookmarkStart w:id="22" w:name="step-1-create-the-post-folder"/>
+    <w:p>
+      <w:pPr>
+        <w:pStyle w:val="Heading2"/>
+      </w:pPr>
+      <w:r>
+        <w:t xml:space="preserve">Step 1 — Create the post folder</w:t>
+      </w:r>
+    </w:p>
+    <w:p>
+      <w:pPr>
+        <w:pStyle w:val="FirstParagraph"/>
+      </w:pPr>
+      <w:r>
+        <w:t xml:space="preserve">Pick a short</w:t>
+      </w:r>
+      <w:r>
+        <w:t xml:space="preserve"> </w:t>
+      </w:r>
+      <w:r>
+        <w:t xml:space="preserve">“slug”</w:t>
+      </w:r>
+      <w:r>
+        <w:t xml:space="preserve"> </w:t>
+      </w:r>
+      <w:r>
+        <w:t xml:space="preserve">(lowercase words joined by hyphens) — this becomes the web</w:t>
+      </w:r>
+      <w:r>
+        <w:t xml:space="preserve"> </w:t>
+      </w:r>
+      <w:r>
+        <w:t xml:space="preserve">address, e.g. </w:t>
+      </w:r>
+      <w:r>
+        <w:rPr>
+          <w:rStyle w:val="VerbatimChar"/>
+        </w:rPr>
+        <w:t xml:space="preserve">the-matthew-effect</w:t>
+      </w:r>
+      <w:r>
+        <w:t xml:space="preserve"> </w:t>
+      </w:r>
+      <w:r>
+        <w:t xml:space="preserve">→</w:t>
+      </w:r>
+      <w:r>
+        <w:t xml:space="preserve"> </w:t>
+      </w:r>
+      <w:r>
+        <w:rPr>
+          <w:rStyle w:val="VerbatimChar"/>
+        </w:rPr>
+        <w:t xml:space="preserve">bk-advisors.github.io/posts/the-matthew-effect/</w:t>
+      </w:r>
+      <w:r>
+        <w:t xml:space="preserve">.</w:t>
+      </w:r>
+    </w:p>
+    <w:p>
+      <w:pPr>
+        <w:pStyle w:val="BodyText"/>
+      </w:pPr>
+      <w:r>
+        <w:t xml:space="preserve">Copy the template into a new folder. From the project root (see Step 0):</w:t>
+      </w:r>
+    </w:p>
+    <w:p>
+      <w:pPr>
+        <w:pStyle w:val="SourceCode"/>
+      </w:pPr>
+      <w:r>
+        <w:rPr>
+          <w:rStyle w:val="VerbatimChar"/>
+        </w:rPr>
+        <w:t xml:space="preserve">mkdir posts\the-matthew-effect\images</w:t>
+      </w:r>
+      <w:r>
+        <w:br/>
+      </w:r>
+      <w:r>
+        <w:rPr>
+          <w:rStyle w:val="VerbatimChar"/>
+        </w:rPr>
+        <w:t xml:space="preserve">copy posts\_post-template.qmd posts\the-matthew-effect\index.qmd</w:t>
+      </w:r>
+    </w:p>
+    <w:p>
+      <w:pPr>
+        <w:pStyle w:val="FirstParagraph"/>
+      </w:pPr>
+      <w:r>
+        <w:t xml:space="preserve">(The first command makes both</w:t>
+      </w:r>
+      <w:r>
+        <w:t xml:space="preserve"> </w:t>
+      </w:r>
+      <w:r>
+        <w:rPr>
+          <w:rStyle w:val="VerbatimChar"/>
+        </w:rPr>
+        <w:t xml:space="preserve">posts\the-matthew-effect\</w:t>
+      </w:r>
+      <w:r>
+        <w:t xml:space="preserve"> </w:t>
+      </w:r>
+      <w:r>
+        <w:t xml:space="preserve">and its</w:t>
+      </w:r>
+      <w:r>
+        <w:t xml:space="preserve"> </w:t>
+      </w:r>
+      <w:r>
+        <w:rPr>
+          <w:rStyle w:val="VerbatimChar"/>
+        </w:rPr>
+        <w:t xml:space="preserve">images\</w:t>
+      </w:r>
+      <w:r>
+        <w:t xml:space="preserve"> </w:t>
+      </w:r>
+      <w:r>
+        <w:t xml:space="preserve">sub-folder in one go.)</w:t>
+      </w:r>
+    </w:p>
+    <w:p>
+      <w:pPr>
+        <w:pStyle w:val="BodyText"/>
+      </w:pPr>
+      <w:r>
+        <w:rPr>
+          <w:b/>
+          <w:bCs/>
+        </w:rPr>
+        <w:t xml:space="preserve">Success looks like:</w:t>
+      </w:r>
+      <w:r>
+        <w:t xml:space="preserve"> </w:t>
+      </w:r>
+      <w:r>
+        <w:t xml:space="preserve">a new folder</w:t>
+      </w:r>
+      <w:r>
+        <w:t xml:space="preserve"> </w:t>
+      </w:r>
+      <w:r>
+        <w:rPr>
+          <w:rStyle w:val="VerbatimChar"/>
+        </w:rPr>
+        <w:t xml:space="preserve">posts\the-matthew-effect\</w:t>
+      </w:r>
+      <w:r>
+        <w:t xml:space="preserve"> </w:t>
+      </w:r>
+      <w:r>
+        <w:t xml:space="preserve">containing</w:t>
+      </w:r>
+      <w:r>
+        <w:t xml:space="preserve"> </w:t>
+      </w:r>
+      <w:r>
+        <w:rPr>
+          <w:rStyle w:val="VerbatimChar"/>
+        </w:rPr>
+        <w:t xml:space="preserve">index.qmd</w:t>
+      </w:r>
+      <w:r>
+        <w:t xml:space="preserve"> </w:t>
+      </w:r>
+      <w:r>
+        <w:t xml:space="preserve">and an empty</w:t>
+      </w:r>
+      <w:r>
+        <w:t xml:space="preserve"> </w:t>
+      </w:r>
+      <w:r>
+        <w:rPr>
+          <w:rStyle w:val="VerbatimChar"/>
+        </w:rPr>
+        <w:t xml:space="preserve">images</w:t>
+      </w:r>
+      <w:r>
+        <w:t xml:space="preserve"> </w:t>
+      </w:r>
+      <w:r>
+        <w:t xml:space="preserve">folder — and</w:t>
+      </w:r>
+      <w:r>
+        <w:t xml:space="preserve"> </w:t>
+      </w:r>
+      <w:r>
+        <w:rPr>
+          <w:b/>
+          <w:bCs/>
+        </w:rPr>
+        <w:t xml:space="preserve">no</w:t>
+      </w:r>
+      <w:r>
+        <w:t xml:space="preserve"> </w:t>
+      </w:r>
+      <w:r>
+        <w:rPr>
+          <w:rStyle w:val="VerbatimChar"/>
+        </w:rPr>
+        <w:t xml:space="preserve">posts\posts\</w:t>
+      </w:r>
+      <w:r>
+        <w:t xml:space="preserve"> </w:t>
+      </w:r>
+      <w:r>
+        <w:t xml:space="preserve">folder.</w:t>
+      </w:r>
+      <w:r>
+        <w:t xml:space="preserve"> </w:t>
+      </w:r>
+      <w:r>
+        <w:t xml:space="preserve">If you ever see a</w:t>
+      </w:r>
+      <w:r>
+        <w:t xml:space="preserve"> </w:t>
+      </w:r>
+      <w:r>
+        <w:rPr>
+          <w:rStyle w:val="VerbatimChar"/>
+        </w:rPr>
+        <w:t xml:space="preserve">posts\posts\</w:t>
+      </w:r>
+      <w:r>
+        <w:t xml:space="preserve"> </w:t>
+      </w:r>
+      <w:r>
+        <w:t xml:space="preserve">folder, you ran Step 1 from inside</w:t>
+      </w:r>
+      <w:r>
+        <w:t xml:space="preserve"> </w:t>
+      </w:r>
+      <w:r>
+        <w:rPr>
+          <w:rStyle w:val="VerbatimChar"/>
+        </w:rPr>
+        <w:t xml:space="preserve">posts</w:t>
+      </w:r>
+      <w:r>
+        <w:t xml:space="preserve">;</w:t>
+      </w:r>
+      <w:r>
+        <w:t xml:space="preserve"> </w:t>
+      </w:r>
+      <w:r>
+        <w:t xml:space="preserve">delete the stray</w:t>
+      </w:r>
+      <w:r>
+        <w:t xml:space="preserve"> </w:t>
+      </w:r>
+      <w:r>
+        <w:rPr>
+          <w:rStyle w:val="VerbatimChar"/>
+        </w:rPr>
+        <w:t xml:space="preserve">posts\posts\</w:t>
+      </w:r>
+      <w:r>
+        <w:t xml:space="preserve"> </w:t>
+      </w:r>
+      <w:r>
+        <w:t xml:space="preserve">folder and redo from Step 0.</w:t>
+      </w:r>
+    </w:p>
+    <w:bookmarkEnd w:id="22"/>
+    <w:bookmarkStart w:id="23" w:name="X491b6c6a05ee6266c0a4a61bb751f404fa1e581"/>
+    <w:p>
+      <w:pPr>
+        <w:pStyle w:val="Heading2"/>
+      </w:pPr>
+      <w:r>
+        <w:t xml:space="preserve">Step 2 — Paste your article and fill in the details</w:t>
+      </w:r>
+    </w:p>
+    <w:p>
+      <w:pPr>
+        <w:pStyle w:val="FirstParagraph"/>
+      </w:pPr>
+      <w:r>
+        <w:t xml:space="preserve">Open</w:t>
+      </w:r>
+      <w:r>
+        <w:t xml:space="preserve"> </w:t>
+      </w:r>
+      <w:r>
+        <w:rPr>
+          <w:rStyle w:val="VerbatimChar"/>
+        </w:rPr>
+        <w:t xml:space="preserve">posts\the-matthew-effect\index.qmd</w:t>
+      </w:r>
+      <w:r>
+        <w:t xml:space="preserve"> </w:t>
+      </w:r>
+      <w:r>
+        <w:t xml:space="preserve">in any text editor.</w:t>
+      </w:r>
+    </w:p>
+    <w:p>
+      <w:pPr>
+        <w:pStyle w:val="BodyText"/>
+      </w:pPr>
+      <w:r>
+        <w:t xml:space="preserve">At the very top, between the two</w:t>
+      </w:r>
+      <w:r>
+        <w:t xml:space="preserve"> </w:t>
+      </w:r>
+      <w:r>
+        <w:rPr>
+          <w:rStyle w:val="VerbatimChar"/>
+        </w:rPr>
+        <w:t xml:space="preserve">---</w:t>
+      </w:r>
+      <w:r>
+        <w:t xml:space="preserve"> </w:t>
+      </w:r>
+      <w:r>
+        <w:t xml:space="preserve">lines, fill in the five fields (keep the</w:t>
+      </w:r>
+      <w:r>
+        <w:t xml:space="preserve"> </w:t>
+      </w:r>
+      <w:r>
+        <w:t xml:space="preserve">quotation marks):</w:t>
+      </w:r>
+    </w:p>
+    <w:p>
+      <w:pPr>
+        <w:pStyle w:val="SourceCode"/>
+      </w:pPr>
+      <w:r>
+        <w:rPr>
+          <w:rStyle w:val="VerbatimChar"/>
+        </w:rPr>
+        <w:t xml:space="preserve">---</w:t>
+      </w:r>
+      <w:r>
+        <w:br/>
+      </w:r>
+      <w:r>
+        <w:rPr>
+          <w:rStyle w:val="VerbatimChar"/>
+        </w:rPr>
+        <w:t xml:space="preserve">title: "The Matthew Effect"</w:t>
+      </w:r>
+      <w:r>
+        <w:br/>
+      </w:r>
+      <w:r>
+        <w:rPr>
+          <w:rStyle w:val="VerbatimChar"/>
+        </w:rPr>
+        <w:t xml:space="preserve">date: "2025-09-30"</w:t>
+      </w:r>
+      <w:r>
+        <w:br/>
+      </w:r>
+      <w:r>
+        <w:rPr>
+          <w:rStyle w:val="VerbatimChar"/>
+        </w:rPr>
+        <w:t xml:space="preserve">categories: [Political Economy]</w:t>
+      </w:r>
+      <w:r>
+        <w:br/>
+      </w:r>
+      <w:r>
+        <w:rPr>
+          <w:rStyle w:val="VerbatimChar"/>
+        </w:rPr>
+        <w:t xml:space="preserve">image: "images/cover.jpg"</w:t>
+      </w:r>
+      <w:r>
+        <w:br/>
+      </w:r>
+      <w:r>
+        <w:rPr>
+          <w:rStyle w:val="VerbatimChar"/>
+        </w:rPr>
+        <w:t xml:space="preserve">description: "One sentence that will appear on the home-page card."</w:t>
+      </w:r>
+      <w:r>
+        <w:br/>
+      </w:r>
+      <w:r>
+        <w:rPr>
+          <w:rStyle w:val="VerbatimChar"/>
+        </w:rPr>
+        <w:t xml:space="preserve">---</w:t>
+      </w:r>
+    </w:p>
+    <w:p>
+      <w:pPr>
+        <w:pStyle w:val="FirstParagraph"/>
+      </w:pPr>
+      <w:r>
+        <w:t xml:space="preserve">Then</w:t>
+      </w:r>
+      <w:r>
+        <w:t xml:space="preserve"> </w:t>
+      </w:r>
+      <w:r>
+        <w:rPr>
+          <w:b/>
+          <w:bCs/>
+        </w:rPr>
+        <w:t xml:space="preserve">delete the instructional comment block</w:t>
+      </w:r>
+      <w:r>
+        <w:t xml:space="preserve"> </w:t>
+      </w:r>
+      <w:r>
+        <w:t xml:space="preserve">and</w:t>
+      </w:r>
+      <w:r>
+        <w:t xml:space="preserve"> </w:t>
+      </w:r>
+      <w:r>
+        <w:rPr>
+          <w:b/>
+          <w:bCs/>
+        </w:rPr>
+        <w:t xml:space="preserve">paste your LinkedIn</w:t>
+      </w:r>
+      <w:r>
+        <w:rPr>
+          <w:b/>
+          <w:bCs/>
+        </w:rPr>
+        <w:t xml:space="preserve"> </w:t>
+      </w:r>
+      <w:r>
+        <w:rPr>
+          <w:b/>
+          <w:bCs/>
+        </w:rPr>
+        <w:t xml:space="preserve">article text</w:t>
+      </w:r>
+      <w:r>
+        <w:t xml:space="preserve"> </w:t>
+      </w:r>
+      <w:r>
+        <w:t xml:space="preserve">below it. Drop your cover picture into the post’s</w:t>
+      </w:r>
+      <w:r>
+        <w:t xml:space="preserve"> </w:t>
+      </w:r>
+      <w:r>
+        <w:rPr>
+          <w:rStyle w:val="VerbatimChar"/>
+        </w:rPr>
+        <w:t xml:space="preserve">images</w:t>
+      </w:r>
+      <w:r>
+        <w:t xml:space="preserve"> </w:t>
+      </w:r>
+      <w:r>
+        <w:t xml:space="preserve">folder and make sure the</w:t>
+      </w:r>
+      <w:r>
+        <w:t xml:space="preserve"> </w:t>
+      </w:r>
+      <w:r>
+        <w:rPr>
+          <w:rStyle w:val="VerbatimChar"/>
+        </w:rPr>
+        <w:t xml:space="preserve">image:</w:t>
+      </w:r>
+      <w:r>
+        <w:t xml:space="preserve"> </w:t>
+      </w:r>
+      <w:r>
+        <w:t xml:space="preserve">line points at its file name.</w:t>
+      </w:r>
+    </w:p>
+    <w:p>
+      <w:pPr>
+        <w:pStyle w:val="BodyText"/>
+      </w:pPr>
+      <w:r>
+        <w:t xml:space="preserve">See</w:t>
+      </w:r>
+      <w:r>
+        <w:t xml:space="preserve"> </w:t>
+      </w:r>
+      <w:r>
+        <w:rPr>
+          <w:i/>
+          <w:iCs/>
+        </w:rPr>
+        <w:t xml:space="preserve">Front-matter at a glance</w:t>
+      </w:r>
+      <w:r>
+        <w:t xml:space="preserve"> </w:t>
+      </w:r>
+      <w:r>
+        <w:t xml:space="preserve">and the</w:t>
+      </w:r>
+      <w:r>
+        <w:t xml:space="preserve"> </w:t>
+      </w:r>
+      <w:r>
+        <w:rPr>
+          <w:i/>
+          <w:iCs/>
+        </w:rPr>
         <w:t xml:space="preserve">Formatting cheatsheet</w:t>
       </w:r>
       <w:r>
@@ -727,8 +1000,8 @@
         <w:t xml:space="preserve">on the next page.</w:t>
       </w:r>
     </w:p>
-    <w:bookmarkEnd w:id="22"/>
-    <w:bookmarkStart w:id="23" w:name="step-3-build-the-site"/>
+    <w:bookmarkEnd w:id="23"/>
+    <w:bookmarkStart w:id="24" w:name="step-3-build-the-site"/>
     <w:p>
       <w:pPr>
         <w:pStyle w:val="Heading2"/>
@@ -857,8 +1130,135 @@
         <w:t xml:space="preserve">to stop the preview.</w:t>
       </w:r>
     </w:p>
-    <w:bookmarkEnd w:id="23"/>
-    <w:bookmarkStart w:id="24" w:name="step-4-publish"/>
+    <w:p>
+      <w:pPr>
+        <w:pStyle w:val="BlockText"/>
+      </w:pPr>
+      <w:r>
+        <w:rPr>
+          <w:b/>
+          <w:bCs/>
+        </w:rPr>
+        <w:t xml:space="preserve">IMPORTANT — make the post visible.</w:t>
+      </w:r>
+      <w:r>
+        <w:t xml:space="preserve"> </w:t>
+      </w:r>
+      <w:r>
+        <w:t xml:space="preserve">New posts start</w:t>
+      </w:r>
+      <w:r>
+        <w:t xml:space="preserve"> </w:t>
+      </w:r>
+      <w:r>
+        <w:rPr>
+          <w:b/>
+          <w:bCs/>
+        </w:rPr>
+        <w:t xml:space="preserve">hidden</w:t>
+      </w:r>
+      <w:r>
+        <w:t xml:space="preserve"> </w:t>
+      </w:r>
+      <w:r>
+        <w:t xml:space="preserve">(the</w:t>
+      </w:r>
+      <w:r>
+        <w:t xml:space="preserve"> </w:t>
+      </w:r>
+      <w:r>
+        <w:t xml:space="preserve">template has a line</w:t>
+      </w:r>
+      <w:r>
+        <w:t xml:space="preserve"> </w:t>
+      </w:r>
+      <w:r>
+        <w:rPr>
+          <w:rStyle w:val="VerbatimChar"/>
+        </w:rPr>
+        <w:t xml:space="preserve">draft: true</w:t>
+      </w:r>
+      <w:r>
+        <w:t xml:space="preserve">). While it is there, the post will NOT</w:t>
+      </w:r>
+      <w:r>
+        <w:t xml:space="preserve"> </w:t>
+      </w:r>
+      <w:r>
+        <w:t xml:space="preserve">appear on the home page. When the article is finished and you are happy with</w:t>
+      </w:r>
+      <w:r>
+        <w:t xml:space="preserve"> </w:t>
+      </w:r>
+      <w:r>
+        <w:t xml:space="preserve">the preview, open</w:t>
+      </w:r>
+      <w:r>
+        <w:t xml:space="preserve"> </w:t>
+      </w:r>
+      <w:r>
+        <w:rPr>
+          <w:rStyle w:val="VerbatimChar"/>
+        </w:rPr>
+        <w:t xml:space="preserve">index.qmd</w:t>
+      </w:r>
+      <w:r>
+        <w:t xml:space="preserve"> </w:t>
+      </w:r>
+      <w:r>
+        <w:t xml:space="preserve">and</w:t>
+      </w:r>
+      <w:r>
+        <w:t xml:space="preserve"> </w:t>
+      </w:r>
+      <w:r>
+        <w:rPr>
+          <w:b/>
+          <w:bCs/>
+        </w:rPr>
+        <w:t xml:space="preserve">delete the whole</w:t>
+      </w:r>
+      <w:r>
+        <w:rPr>
+          <w:b/>
+          <w:bCs/>
+        </w:rPr>
+        <w:t xml:space="preserve"> </w:t>
+      </w:r>
+      <w:r>
+        <w:rPr>
+          <w:rStyle w:val="VerbatimChar"/>
+          <w:b/>
+          <w:bCs/>
+        </w:rPr>
+        <w:t xml:space="preserve">draft: true</w:t>
+      </w:r>
+      <w:r>
+        <w:rPr>
+          <w:b/>
+          <w:bCs/>
+        </w:rPr>
+        <w:t xml:space="preserve"> </w:t>
+      </w:r>
+      <w:r>
+        <w:rPr>
+          <w:b/>
+          <w:bCs/>
+        </w:rPr>
+        <w:t xml:space="preserve">line</w:t>
+      </w:r>
+      <w:r>
+        <w:t xml:space="preserve">,</w:t>
+      </w:r>
+      <w:r>
+        <w:t xml:space="preserve"> </w:t>
+      </w:r>
+      <w:r>
+        <w:t xml:space="preserve">then render again. (Leave it in if you want to keep the post hidden for now.)</w:t>
+      </w:r>
+    </w:p>
+    <w:bookmarkEnd w:id="24"/>
+    <w:bookmarkStart w:id="25" w:name="step-4-publish"/>
     <w:p>
       <w:pPr>
         <w:pStyle w:val="Heading2"/>
@@ -925,9 +1325,9 @@
         <w:t xml:space="preserve">page, categories, search, and feed have already updated themselves.</w:t>
       </w:r>
     </w:p>
-    <w:bookmarkEnd w:id="24"/>
     <w:bookmarkEnd w:id="25"/>
-    <w:bookmarkStart w:id="26" w:name="front-matter-at-a-glance"/>
+    <w:bookmarkEnd w:id="26"/>
+    <w:bookmarkStart w:id="27" w:name="front-matter-at-a-glance"/>
     <w:p>
       <w:pPr>
         <w:pStyle w:val="Heading1"/>
@@ -1296,8 +1696,8 @@
         <w:t xml:space="preserve">to the front-matter.</w:t>
       </w:r>
     </w:p>
-    <w:bookmarkEnd w:id="26"/>
-    <w:bookmarkStart w:id="27" w:name="formatting-cheatsheet-linkedin-web"/>
+    <w:bookmarkEnd w:id="27"/>
+    <w:bookmarkStart w:id="28" w:name="formatting-cheatsheet-linkedin-web"/>
     <w:p>
       <w:pPr>
         <w:pStyle w:val="Heading1"/>
@@ -1624,8 +2024,8 @@
         </w:tc>
       </w:tr>
     </w:tbl>
-    <w:bookmarkEnd w:id="27"/>
-    <w:bookmarkStart w:id="28" w:name="before-you-publish-quick-checklist"/>
+    <w:bookmarkEnd w:id="28"/>
+    <w:bookmarkStart w:id="29" w:name="before-you-publish-quick-checklist"/>
     <w:p>
       <w:pPr>
         <w:pStyle w:val="Heading1"/>
@@ -1794,8 +2194,8 @@
         <w:t xml:space="preserve">.</w:t>
       </w:r>
     </w:p>
-    <w:bookmarkEnd w:id="28"/>
-    <w:bookmarkStart w:id="29" w:name="if-something-looks-wrong"/>
+    <w:bookmarkEnd w:id="29"/>
+    <w:bookmarkStart w:id="30" w:name="if-something-looks-wrong"/>
     <w:p>
       <w:pPr>
         <w:pStyle w:val="Heading1"/>
@@ -2047,7 +2447,7 @@
         <w:t xml:space="preserve">in the project folder.</w:t>
       </w:r>
     </w:p>
-    <w:bookmarkEnd w:id="29"/>
+    <w:bookmarkEnd w:id="30"/>
     <w:sectPr>
       <w:footnotePr>
         <w:numRestart w:val="eachSect"/>

</xml_diff>